<commit_message>
Final AI System with UI and docs
</commit_message>
<xml_diff>
--- a/AI System to Automatically Review and Summarize Research Papers/docs/Milestone2.docx
+++ b/AI System to Automatically Review and Summarize Research Papers/docs/Milestone2.docx
@@ -239,31 +239,7 @@
           <w:lang w:eastAsia="en-IN"/>
           <w14:ligatures w14:val="none"/>
         </w:rPr>
-        <w:t>PyMuPDF (</w:t>
-      </w:r>
-      <w:proofErr w:type="spellStart"/>
-      <w:r>
-        <w:rPr>
-          <w:rFonts w:ascii="Calibri" w:eastAsia="Times New Roman" w:hAnsi="Calibri" w:cs="Calibri"/>
-          <w:b/>
-          <w:bCs/>
-          <w:kern w:val="0"/>
-          <w:lang w:eastAsia="en-IN"/>
-          <w14:ligatures w14:val="none"/>
-        </w:rPr>
-        <w:t>fitz</w:t>
-      </w:r>
-      <w:proofErr w:type="spellEnd"/>
-      <w:r>
-        <w:rPr>
-          <w:rFonts w:ascii="Calibri" w:eastAsia="Times New Roman" w:hAnsi="Calibri" w:cs="Calibri"/>
-          <w:b/>
-          <w:bCs/>
-          <w:kern w:val="0"/>
-          <w:lang w:eastAsia="en-IN"/>
-          <w14:ligatures w14:val="none"/>
-        </w:rPr>
-        <w:t>)</w:t>
+        <w:t>PyMuPDF (fitz)</w:t>
       </w:r>
       <w:r>
         <w:rPr>
@@ -307,21 +283,8 @@
           <w:lang w:eastAsia="en-IN"/>
           <w14:ligatures w14:val="none"/>
         </w:rPr>
-        <w:t>langchain / langchain-google-</w:t>
-      </w:r>
-      <w:proofErr w:type="spellStart"/>
-      <w:r>
-        <w:rPr>
-          <w:rFonts w:ascii="Calibri" w:eastAsia="Times New Roman" w:hAnsi="Calibri" w:cs="Calibri"/>
-          <w:b/>
-          <w:bCs/>
-          <w:kern w:val="0"/>
-          <w:lang w:eastAsia="en-IN"/>
-          <w14:ligatures w14:val="none"/>
-        </w:rPr>
-        <w:t>genai</w:t>
-      </w:r>
-      <w:proofErr w:type="spellEnd"/>
+        <w:t>langchain / langchain-google-genai</w:t>
+      </w:r>
       <w:r>
         <w:rPr>
           <w:rFonts w:ascii="Calibri" w:eastAsia="Times New Roman" w:hAnsi="Calibri" w:cs="Calibri"/>
@@ -520,6 +483,7 @@
       <w:r>
         <w:rPr>
           <w:rFonts w:ascii="Calibri" w:eastAsia="Times New Roman" w:hAnsi="Calibri" w:cs="Calibri"/>
+          <w:noProof/>
           <w:kern w:val="0"/>
           <w:lang w:eastAsia="en-IN"/>
           <w14:ligatures w14:val="none"/>
@@ -689,6 +653,7 @@
       <w:r>
         <w:rPr>
           <w:rFonts w:ascii="Calibri" w:eastAsia="Times New Roman" w:hAnsi="Calibri" w:cs="Calibri"/>
+          <w:noProof/>
           <w:kern w:val="0"/>
           <w:lang w:eastAsia="en-IN"/>
           <w14:ligatures w14:val="none"/>
@@ -856,6 +821,7 @@
       <w:r>
         <w:rPr>
           <w:rFonts w:ascii="Calibri" w:eastAsia="Times New Roman" w:hAnsi="Calibri" w:cs="Calibri"/>
+          <w:noProof/>
           <w:kern w:val="0"/>
           <w:lang w:eastAsia="en-IN"/>
           <w14:ligatures w14:val="none"/>
@@ -948,7 +914,6 @@
         </w:rPr>
         <w:t xml:space="preserve">6. </w:t>
       </w:r>
-      <w:proofErr w:type="spellStart"/>
       <w:r>
         <w:rPr>
           <w:rFonts w:ascii="Calibri" w:eastAsia="Times New Roman" w:hAnsi="Calibri" w:cs="Calibri"/>
@@ -960,21 +925,7 @@
           <w:lang w:eastAsia="en-IN"/>
           <w14:ligatures w14:val="none"/>
         </w:rPr>
-        <w:t>LangGraph</w:t>
-      </w:r>
-      <w:proofErr w:type="spellEnd"/>
-      <w:r>
-        <w:rPr>
-          <w:rFonts w:ascii="Calibri" w:eastAsia="Times New Roman" w:hAnsi="Calibri" w:cs="Calibri"/>
-          <w:b/>
-          <w:bCs/>
-          <w:kern w:val="0"/>
-          <w:sz w:val="32"/>
-          <w:szCs w:val="32"/>
-          <w:lang w:eastAsia="en-IN"/>
-          <w14:ligatures w14:val="none"/>
-        </w:rPr>
-        <w:t xml:space="preserve"> Pipeline Refactoring</w:t>
+        <w:t>LangGraph Pipeline Refactoring</w:t>
       </w:r>
     </w:p>
     <w:p>
@@ -994,27 +945,7 @@
           <w:lang w:eastAsia="en-IN"/>
           <w14:ligatures w14:val="none"/>
         </w:rPr>
-        <w:t xml:space="preserve">To ensure modularity and scalability, the extraction, normalization, and sectioning steps were refactored into a </w:t>
-      </w:r>
-      <w:proofErr w:type="spellStart"/>
-      <w:r>
-        <w:rPr>
-          <w:rFonts w:ascii="Calibri" w:eastAsia="Times New Roman" w:hAnsi="Calibri" w:cs="Calibri"/>
-          <w:kern w:val="0"/>
-          <w:lang w:eastAsia="en-IN"/>
-          <w14:ligatures w14:val="none"/>
-        </w:rPr>
-        <w:t>LangGraph</w:t>
-      </w:r>
-      <w:proofErr w:type="spellEnd"/>
-      <w:r>
-        <w:rPr>
-          <w:rFonts w:ascii="Calibri" w:eastAsia="Times New Roman" w:hAnsi="Calibri" w:cs="Calibri"/>
-          <w:kern w:val="0"/>
-          <w:lang w:eastAsia="en-IN"/>
-          <w14:ligatures w14:val="none"/>
-        </w:rPr>
-        <w:t>-based pipeline.</w:t>
+        <w:t>To ensure modularity and scalability, the extraction, normalization, and sectioning steps were refactored into a LangGraph-based pipeline.</w:t>
       </w:r>
     </w:p>
     <w:p>
@@ -1221,6 +1152,7 @@
       <w:r>
         <w:rPr>
           <w:rFonts w:ascii="Calibri" w:eastAsia="Times New Roman" w:hAnsi="Calibri" w:cs="Calibri"/>
+          <w:noProof/>
           <w:kern w:val="0"/>
           <w:lang w:eastAsia="en-IN"/>
           <w14:ligatures w14:val="none"/>
@@ -1527,6 +1459,7 @@
       <w:r>
         <w:rPr>
           <w:rFonts w:ascii="Calibri" w:eastAsia="Times New Roman" w:hAnsi="Calibri" w:cs="Calibri"/>
+          <w:noProof/>
           <w:kern w:val="0"/>
           <w:lang w:eastAsia="en-IN"/>
           <w14:ligatures w14:val="none"/>
@@ -1671,6 +1604,7 @@
       <w:r>
         <w:rPr>
           <w:rFonts w:ascii="Calibri" w:eastAsia="Times New Roman" w:hAnsi="Calibri" w:cs="Calibri"/>
+          <w:noProof/>
           <w:kern w:val="0"/>
           <w:lang w:eastAsia="en-IN"/>
           <w14:ligatures w14:val="none"/>
@@ -1830,6 +1764,7 @@
       <w:r>
         <w:rPr>
           <w:rFonts w:ascii="Calibri" w:eastAsia="Times New Roman" w:hAnsi="Calibri" w:cs="Calibri"/>
+          <w:noProof/>
           <w:kern w:val="0"/>
           <w:lang w:eastAsia="en-IN"/>
           <w14:ligatures w14:val="none"/>
@@ -1943,7 +1878,25 @@
           <w:lang w:eastAsia="en-IN"/>
           <w14:ligatures w14:val="none"/>
         </w:rPr>
-        <w:t>Milestone 1 establishes a reliable and automated pipeline for research paper retrieval and dataset preparation. The modular design ensures scalability and provides a strong foundation for further development in the next milestones.</w:t>
+        <w:t xml:space="preserve">Milestone </w:t>
+      </w:r>
+      <w:r>
+        <w:rPr>
+          <w:rFonts w:ascii="Calibri" w:eastAsia="Times New Roman" w:hAnsi="Calibri" w:cs="Calibri"/>
+          <w:kern w:val="0"/>
+          <w:lang w:eastAsia="en-IN"/>
+          <w14:ligatures w14:val="none"/>
+        </w:rPr>
+        <w:t>2</w:t>
+      </w:r>
+      <w:r>
+        <w:rPr>
+          <w:rFonts w:ascii="Calibri" w:eastAsia="Times New Roman" w:hAnsi="Calibri" w:cs="Calibri"/>
+          <w:kern w:val="0"/>
+          <w:lang w:eastAsia="en-IN"/>
+          <w14:ligatures w14:val="none"/>
+        </w:rPr>
+        <w:t xml:space="preserve"> establishes a reliable and automated pipeline for research paper retrieval and dataset preparation. The modular design ensures scalability and provides a strong foundation for further development in the next milestones.</w:t>
       </w:r>
     </w:p>
     <w:p>
@@ -4063,6 +4016,7 @@
   <w:style w:type="character" w:default="1" w:styleId="DefaultParagraphFont">
     <w:name w:val="Default Paragraph Font"/>
     <w:uiPriority w:val="1"/>
+    <w:semiHidden/>
     <w:unhideWhenUsed/>
   </w:style>
   <w:style w:type="table" w:default="1" w:styleId="TableNormal">

</xml_diff>